<commit_message>
docs(entregables): refresh Word report with green CI screenshots
Co-authored-by: Cursor <cursoragent@cursor.com>
</commit_message>
<xml_diff>
--- a/entregables/Informe_Actividad_DevSecOps_Kasterz.docx
+++ b/entregables/Informe_Actividad_DevSecOps_Kasterz.docx
@@ -22,7 +22,7 @@
         <w:rPr>
           <w:sz w:val="20"/>
         </w:rPr>
-        <w:t>Proyecto Kasterz (localops-crm) · Next.js 16 · Auth.js · Prisma/SQLite · GitHub Actions · Docker Compose · 2026-08-09</w:t>
+        <w:t>Proyecto Kasterz (localops-crm) · Next.js 16 · Auth.js · Prisma/SQLite · GitHub Actions · Docker Compose · 2026-08-10</w:t>
       </w:r>
     </w:p>
     <w:p>
@@ -826,7 +826,7 @@
       <w:r>
         <w:drawing>
           <wp:inline xmlns:a="http://schemas.openxmlformats.org/drawingml/2006/main" xmlns:pic="http://schemas.openxmlformats.org/drawingml/2006/picture">
-            <wp:extent cx="5669280" cy="1133856"/>
+            <wp:extent cx="5669280" cy="3986212"/>
             <wp:docPr id="10" name="Picture 10"/>
             <wp:cNvGraphicFramePr>
               <a:graphicFrameLocks noChangeAspect="1"/>
@@ -847,7 +847,7 @@
                   <pic:spPr>
                     <a:xfrm>
                       <a:off x="0" y="0"/>
-                      <a:ext cx="5669280" cy="1133856"/>
+                      <a:ext cx="5669280" cy="3986212"/>
                     </a:xfrm>
                     <a:prstGeom prst="rect"/>
                   </pic:spPr>

</xml_diff>